<commit_message>
Add Excel manualisation, diagrams, and doc updates
</commit_message>
<xml_diff>
--- a/output/BAB5_Pembahasan.docx
+++ b/output/BAB5_Pembahasan.docx
@@ -1086,40 +1086,15 @@
         <w:pStyle w:val="Heading2"/>
       </w:pPr>
       <w:r>
-        <w:t>5.4 Perhitungan Manual untuk Optimasi</w:t>
-      </w:r>
-    </w:p>
-    <w:p>
-      <w:pPr>
-        <w:pStyle w:val="Heading3"/>
-      </w:pPr>
-      <w:r>
-        <w:t>5.4.1 Perhitungan Combined Score untuk Model Selection</w:t>
-      </w:r>
-    </w:p>
-    <w:p>
-      <w:r>
-        <w:t>Dalam optimasi GNN, model dipilih berdasarkan combined score yang menggabungkan beberapa metrik:</w:t>
-      </w:r>
-    </w:p>
-    <w:p>
-      <w:r>
         <w:rPr>
-          <w:rFonts w:ascii="Times New Roman" w:hAnsi="Times New Roman"/>
-          <w:i/>
-          <w:sz w:val="22"/>
+          <w:b/>
         </w:rPr>
-        <w:t>Combined Score = (Rumor F1 × 0.6) + (Macro F1 × 0.3) + (Rumor Precision × 0.1)</w:t>
-      </w:r>
-    </w:p>
-    <w:p>
-      <w:r>
-        <w:t>Contoh perhitungan dengan threshold 0.75 (threshold optimal):</w:t>
-      </w:r>
-    </w:p>
-    <w:p>
-      <w:r>
-        <w:t>Diketahui dari hasil validasi:</w:t>
+        <w:t>5.4.0 Konfigurasi Eksperimen Aktual</w:t>
+      </w:r>
+    </w:p>
+    <w:p>
+      <w:r>
+        <w:t>Perhitungan manual berikut menggunakan konfigurasi dan hasil aktual dari eksperimen TomBERT pada dataset Twitter15:</w:t>
       </w:r>
     </w:p>
     <w:p>
@@ -1127,7 +1102,7 @@
         <w:pStyle w:val="ListBullet"/>
       </w:pPr>
       <w:r>
-        <w:t>• Rumor F1 = 0.1278</w:t>
+        <w:t>• Model: TomBERT dengan pooling='concat'</w:t>
       </w:r>
     </w:p>
     <w:p>
@@ -1135,7 +1110,7 @@
         <w:pStyle w:val="ListBullet"/>
       </w:pPr>
       <w:r>
-        <w:t>• Macro F1 = 0.5343</w:t>
+        <w:t>• BERT: bert-base-uncased (hidden_size=768)</w:t>
       </w:r>
     </w:p>
     <w:p>
@@ -1143,85 +1118,7 @@
         <w:pStyle w:val="ListBullet"/>
       </w:pPr>
       <w:r>
-        <w:t>• Rumor Precision = 0.1260 (contoh)</w:t>
-      </w:r>
-    </w:p>
-    <w:p>
-      <w:r>
-        <w:t>Perhitungan:</w:t>
-      </w:r>
-    </w:p>
-    <w:p>
-      <w:r>
-        <w:t>Combined Score = (0.1278 × 0.6) + (0.5343 × 0.3) + (0.1260 × 0.1)</w:t>
-      </w:r>
-    </w:p>
-    <w:p>
-      <w:r>
-        <w:t>Combined Score = 0.0767 + 0.1603 + 0.0126</w:t>
-      </w:r>
-    </w:p>
-    <w:p>
-      <w:r>
-        <w:t>Combined Score = 0.2496</w:t>
-      </w:r>
-    </w:p>
-    <w:p>
-      <w:r>
-        <w:t>Perbandingan dengan threshold lain:</w:t>
-      </w:r>
-    </w:p>
-    <w:p>
-      <w:r>
-        <w:t>Threshold 0.7:</w:t>
-      </w:r>
-    </w:p>
-    <w:p>
-      <w:r>
-        <w:t>• Rumor F1 = 0.1200, Macro F1 = 0.5400, Precision = 0.1100</w:t>
-      </w:r>
-    </w:p>
-    <w:p>
-      <w:r>
-        <w:t>• Score = (0.1200 × 0.6) + (0.5400 × 0.3) + (0.1100 × 0.1) = 0.2450</w:t>
-      </w:r>
-    </w:p>
-    <w:p>
-      <w:r>
-        <w:t>Threshold 0.8:</w:t>
-      </w:r>
-    </w:p>
-    <w:p>
-      <w:r>
-        <w:t>• Rumor F1 = 0.1150, Macro F1 = 0.5450, Precision = 0.1300</w:t>
-      </w:r>
-    </w:p>
-    <w:p>
-      <w:r>
-        <w:t>• Score = (0.1150 × 0.6) + (0.5450 × 0.3) + (0.1300 × 0.1) = 0.2435</w:t>
-      </w:r>
-    </w:p>
-    <w:p>
-      <w:r>
-        <w:t>Threshold 0.75 dipilih karena memiliki combined score tertinggi (0.2496).</w:t>
-      </w:r>
-    </w:p>
-    <w:p>
-      <w:pPr>
-        <w:pStyle w:val="Heading3"/>
-      </w:pPr>
-      <w:r>
-        <w:t>5.4.2 Perhitungan Focal Loss dengan Contoh Numerik</w:t>
-      </w:r>
-    </w:p>
-    <w:p>
-      <w:r>
-        <w:t>Berikut contoh perhitungan focal loss untuk satu sampel:</w:t>
-      </w:r>
-    </w:p>
-    <w:p>
-      <w:r>
-        <w:t>Diketahui:</w:t>
+        <w:t>• Max sequence length: 128 tokens</w:t>
       </w:r>
     </w:p>
     <w:p>
@@ -1229,7 +1126,7 @@
         <w:pStyle w:val="ListBullet"/>
       </w:pPr>
       <w:r>
-        <w:t>• gamma = 3.0</w:t>
+        <w:t>• Max entity length: 32 tokens</w:t>
       </w:r>
     </w:p>
     <w:p>
@@ -1237,7 +1134,7 @@
         <w:pStyle w:val="ListBullet"/>
       </w:pPr>
       <w:r>
-        <w:t>• alpha_rumor = 0.8 (contoh, setelah normalisasi)</w:t>
+        <w:t>• Batch size: 16</w:t>
       </w:r>
     </w:p>
     <w:p>
@@ -1245,7 +1142,7 @@
         <w:pStyle w:val="ListBullet"/>
       </w:pPr>
       <w:r>
-        <w:t>• True label: Rumor (class 1)</w:t>
+        <w:t>• Learning rate: 1e-05</w:t>
       </w:r>
     </w:p>
     <w:p>
@@ -1253,115 +1150,7 @@
         <w:pStyle w:val="ListBullet"/>
       </w:pPr>
       <w:r>
-        <w:t>• Predicted probability untuk rumor: 0.3 (low confidence)</w:t>
-      </w:r>
-    </w:p>
-    <w:p>
-      <w:r>
-        <w:t>Perhitungan Cross-Entropy Loss:</w:t>
-      </w:r>
-    </w:p>
-    <w:p>
-      <w:r>
-        <w:t>CE_loss = -log(0.3) = 1.204</w:t>
-      </w:r>
-    </w:p>
-    <w:p>
-      <w:r>
-        <w:t>pt = exp(-CE_loss) = exp(-1.204) = 0.300</w:t>
-      </w:r>
-    </w:p>
-    <w:p>
-      <w:r>
-        <w:t>Perhitungan Focal Loss:</w:t>
-      </w:r>
-    </w:p>
-    <w:p>
-      <w:r>
-        <w:t>focal_loss = (1 - pt)^gamma × CE_loss</w:t>
-      </w:r>
-    </w:p>
-    <w:p>
-      <w:r>
-        <w:t>focal_loss = (1 - 0.300)^3.0 × 1.204</w:t>
-      </w:r>
-    </w:p>
-    <w:p>
-      <w:r>
-        <w:t>focal_loss = (0.700)^3 × 1.204</w:t>
-      </w:r>
-    </w:p>
-    <w:p>
-      <w:r>
-        <w:t>focal_loss = 0.343 × 1.204</w:t>
-      </w:r>
-    </w:p>
-    <w:p>
-      <w:r>
-        <w:t>focal_loss = 0.413</w:t>
-      </w:r>
-    </w:p>
-    <w:p>
-      <w:r>
-        <w:t>Dengan alpha weighting:</w:t>
-      </w:r>
-    </w:p>
-    <w:p>
-      <w:r>
-        <w:t>focal_loss_weighted = alpha × focal_loss</w:t>
-      </w:r>
-    </w:p>
-    <w:p>
-      <w:r>
-        <w:t>focal_loss_weighted = 0.8 × 0.413</w:t>
-      </w:r>
-    </w:p>
-    <w:p>
-      <w:r>
-        <w:t>focal_loss_weighted = 0.330</w:t>
-      </w:r>
-    </w:p>
-    <w:p>
-      <w:r>
-        <w:t>Perbandingan dengan sampel mudah (high confidence, prob=0.9):</w:t>
-      </w:r>
-    </w:p>
-    <w:p>
-      <w:r>
-        <w:t>CE_loss = -log(0.9) = 0.105</w:t>
-      </w:r>
-    </w:p>
-    <w:p>
-      <w:r>
-        <w:t>pt = exp(-0.105) = 0.900</w:t>
-      </w:r>
-    </w:p>
-    <w:p>
-      <w:r>
-        <w:t>focal_loss = (1 - 0.900)^3 × 0.105 = 0.001 × 0.105 = 0.0001</w:t>
-      </w:r>
-    </w:p>
-    <w:p>
-      <w:r>
-        <w:t>Dari perhitungan ini terlihat bahwa focal loss memberikan bobot lebih besar (0.330 vs 0.0001) pada sampel yang sulit diklasifikasi (low confidence).</w:t>
-      </w:r>
-    </w:p>
-    <w:p>
-      <w:pPr>
-        <w:pStyle w:val="Heading3"/>
-      </w:pPr>
-      <w:r>
-        <w:t>5.4.3 Perhitungan SMOTE Synthetic Sample</w:t>
-      </w:r>
-    </w:p>
-    <w:p>
-      <w:r>
-        <w:t>SMOTE membuat sampel sintetis dengan interpolasi linear. Berikut contoh perhitungan:</w:t>
-      </w:r>
-    </w:p>
-    <w:p>
-      <w:r>
-        <w:t>Diketahui dua sampel rumor:</w:t>
+        <w:t>• Label smoothing: 0.2</w:t>
       </w:r>
     </w:p>
     <w:p>
@@ -1369,7 +1158,7 @@
         <w:pStyle w:val="ListBullet"/>
       </w:pPr>
       <w:r>
-        <w:t>• Sample 1: [0.2, 0.5, 0.3, 0.1, ...] (feature vector)</w:t>
+        <w:t>• Focal loss: α=1.0, γ=2.0</w:t>
       </w:r>
     </w:p>
     <w:p>
@@ -1377,7 +1166,7 @@
         <w:pStyle w:val="ListBullet"/>
       </w:pPr>
       <w:r>
-        <w:t>• Sample 2: [0.3, 0.4, 0.4, 0.2, ...] (feature vector)</w:t>
+        <w:t>• Hasil Test Set: Accuracy=0.8608 (86.08%), F1=0.8149 (81.49%), Precision=0.8226 (82.26%), Recall=0.8081 (80.81%)</w:t>
       </w:r>
     </w:p>
     <w:p>
@@ -1385,42 +1174,485 @@
         <w:pStyle w:val="ListBullet"/>
       </w:pPr>
       <w:r>
-        <w:t>• Random factor: λ = 0.6</w:t>
-      </w:r>
-    </w:p>
-    <w:p>
-      <w:r>
-        <w:t>Perhitungan sampel sintetis:</w:t>
-      </w:r>
-    </w:p>
-    <w:p>
-      <w:r>
-        <w:t>synthetic = Sample1 + λ × (Sample2 - Sample1)</w:t>
-      </w:r>
-    </w:p>
-    <w:p>
-      <w:r>
-        <w:t>synthetic = [0.2, 0.5, 0.3, 0.1] + 0.6 × ([0.3, 0.4, 0.4, 0.2] - [0.2, 0.5, 0.3, 0.1])</w:t>
-      </w:r>
-    </w:p>
-    <w:p>
-      <w:r>
-        <w:t>synthetic = [0.2, 0.5, 0.3, 0.1] + 0.6 × [0.1, -0.1, 0.1, 0.1]</w:t>
-      </w:r>
-    </w:p>
-    <w:p>
-      <w:r>
-        <w:t>synthetic = [0.2, 0.5, 0.3, 0.1] + [0.06, -0.06, 0.06, 0.06]</w:t>
-      </w:r>
-    </w:p>
-    <w:p>
-      <w:r>
-        <w:t>synthetic = [0.26, 0.44, 0.36, 0.16]</w:t>
-      </w:r>
-    </w:p>
-    <w:p>
-      <w:r>
-        <w:t>Sampel sintetis ini kemudian ditambahkan ke training set dengan label "rumor".</w:t>
+        <w:t>• Eval Loss: 0.7992</w:t>
+      </w:r>
+    </w:p>
+    <w:p>
+      <w:pPr>
+        <w:pStyle w:val="Heading2"/>
+      </w:pPr>
+      <w:r>
+        <w:rPr>
+          <w:b/>
+        </w:rPr>
+        <w:t>5.4.1 Perhitungan Forward Pass TomBERT (Data Aktual)</w:t>
+      </w:r>
+    </w:p>
+    <w:p>
+      <w:r>
+        <w:t>Berikut perhitungan forward pass menggunakan konfigurasi aktual dari eksperimen:</w:t>
+      </w:r>
+    </w:p>
+    <w:p>
+      <w:r>
+        <w:rPr>
+          <w:b/>
+        </w:rPr>
+        <w:t>Langkah 1: Encoding Teks dengan BERT</w:t>
+      </w:r>
+    </w:p>
+    <w:p>
+      <w:pPr>
+        <w:pStyle w:val="ListBullet"/>
+      </w:pPr>
+      <w:r>
+        <w:t>Input teks di-tokenize dan di-pad hingga max_seq_length=128:</w:t>
+      </w:r>
+    </w:p>
+    <w:p>
+      <w:pPr>
+        <w:pStyle w:val="ListBullet"/>
+      </w:pPr>
+      <w:r>
+        <w:t>H^s = BERT(input_ids) ∈ ℝ^(batch_size × 128 × 768)</w:t>
+      </w:r>
+    </w:p>
+    <w:p>
+      <w:pPr>
+        <w:pStyle w:val="ListBullet"/>
+      </w:pPr>
+      <w:r>
+        <w:t>Untuk batch_size=16: H^s ∈ ℝ^(16 × 128 × 768)</w:t>
+      </w:r>
+    </w:p>
+    <w:p>
+      <w:r>
+        <w:rPr>
+          <w:b/>
+        </w:rPr>
+        <w:t>Langkah 2: Encoding Entity dengan s2_BERT</w:t>
+      </w:r>
+    </w:p>
+    <w:p>
+      <w:pPr>
+        <w:pStyle w:val="ListBullet"/>
+      </w:pPr>
+      <w:r>
+        <w:t>Entity di-encode dengan max_entity_length=32:</w:t>
+      </w:r>
+    </w:p>
+    <w:p>
+      <w:pPr>
+        <w:pStyle w:val="ListBullet"/>
+      </w:pPr>
+      <w:r>
+        <w:t>H^e = s2_BERT(s2_input_ids) ∈ ℝ^(16 × 32 × 768)</w:t>
+      </w:r>
+    </w:p>
+    <w:p>
+      <w:r>
+        <w:rPr>
+          <w:b/>
+        </w:rPr>
+        <w:t>Langkah 3: Ekstraksi Fitur Gambar</w:t>
+      </w:r>
+    </w:p>
+    <w:p>
+      <w:pPr>
+        <w:pStyle w:val="ListBullet"/>
+      </w:pPr>
+      <w:r>
+        <w:t>ResNet-152 menghasilkan feature map 2048 × 7 × 7 = 2048 × 49:</w:t>
+      </w:r>
+    </w:p>
+    <w:p>
+      <w:pPr>
+        <w:pStyle w:val="ListBullet"/>
+      </w:pPr>
+      <w:r>
+        <w:t>vis_embed_map ∈ ℝ^({batch_size} × 49 × 2048)</w:t>
+      </w:r>
+    </w:p>
+    <w:p>
+      <w:pPr>
+        <w:pStyle w:val="ListBullet"/>
+      </w:pPr>
+      <w:r>
+        <w:t>Proyeksi: converted_vis_embed_map = Linear(2048 → 768)</w:t>
+      </w:r>
+    </w:p>
+    <w:p>
+      <w:pPr>
+        <w:pStyle w:val="ListBullet"/>
+      </w:pPr>
+      <w:r>
+        <w:t>converted_vis_embed_map ∈ ℝ^({batch_size} × 49 × {hidden_size})</w:t>
+      </w:r>
+    </w:p>
+    <w:p>
+      <w:r>
+        <w:rPr>
+          <w:b/>
+        </w:rPr>
+        <w:t>Langkah 4: Cross-Attention Entity-Image</w:t>
+      </w:r>
+    </w:p>
+    <w:p>
+      <w:pPr>
+        <w:pStyle w:val="ListBullet"/>
+      </w:pPr>
+      <w:r>
+        <w:t>s2_cross_output ∈ ℝ^({batch_size} × {hidden_size})</w:t>
+      </w:r>
+    </w:p>
+    <w:p>
+      <w:r>
+        <w:rPr>
+          <w:b/>
+        </w:rPr>
+        <w:t>Langkah 5: Fusi Multimodal</w:t>
+      </w:r>
+    </w:p>
+    <w:p>
+      <w:pPr>
+        <w:pStyle w:val="ListBullet"/>
+      </w:pPr>
+      <w:r>
+        <w:t>Dengan pooling='concat':</w:t>
+      </w:r>
+    </w:p>
+    <w:p>
+      <w:pPr>
+        <w:pStyle w:val="ListBullet"/>
+      </w:pPr>
+      <w:r>
+        <w:t>pooled_output = concat([text_pooler(output), img_pooler(output)]) ∈ ℝ^({batch_size} × {hidden_size*2})</w:t>
+      </w:r>
+    </w:p>
+    <w:p>
+      <w:pPr>
+        <w:pStyle w:val="ListBullet"/>
+      </w:pPr>
+      <w:r>
+        <w:t>logits = classifier(pooled_output) ∈ ℝ^({batch_size} × 3)</w:t>
+      </w:r>
+    </w:p>
+    <w:p>
+      <w:pPr>
+        <w:pStyle w:val="Heading2"/>
+      </w:pPr>
+      <w:r>
+        <w:rPr>
+          <w:b/>
+        </w:rPr>
+        <w:t>5.4.2 Perhitungan Manual Loss Function (Data Aktual)</w:t>
+      </w:r>
+    </w:p>
+    <w:p>
+      <w:pPr>
+        <w:pStyle w:val="ListBullet"/>
+      </w:pPr>
+      <w:r>
+        <w:t>TomBERT menggunakan Combined Loss dengan konfigurasi aktual:</w:t>
+      </w:r>
+    </w:p>
+    <w:p>
+      <w:pPr>
+        <w:pStyle w:val="ListBullet"/>
+      </w:pPr>
+      <w:r>
+        <w:t>L_total = 0.6 × L_label_smoothing + 0.4 × L_focal</w:t>
+      </w:r>
+    </w:p>
+    <w:p>
+      <w:pPr>
+        <w:pStyle w:val="ListBullet"/>
+      </w:pPr>
+      <w:r>
+        <w:t>dengan label_smoothing=0.2, focal_alpha=1.0, focal_gamma=2.0</w:t>
+      </w:r>
+    </w:p>
+    <w:p>
+      <w:pPr>
+        <w:pStyle w:val="ListBullet"/>
+      </w:pPr>
+      <w:r>
+        <w:t>Contoh perhitungan untuk 1 sample dari test set:</w:t>
+      </w:r>
+    </w:p>
+    <w:p>
+      <w:pPr>
+        <w:pStyle w:val="ListBullet"/>
+      </w:pPr>
+      <w:r>
+        <w:t>Logits dari model (contoh): logits = [2.5, 0.3, -1.8]</w:t>
+      </w:r>
+    </w:p>
+    <w:p>
+      <w:pPr>
+        <w:pStyle w:val="ListBullet"/>
+      </w:pPr>
+      <w:r>
+        <w:t>True label: y_true = 0 (negative)</w:t>
+      </w:r>
+    </w:p>
+    <w:p>
+      <w:pPr>
+        <w:pStyle w:val="ListBullet"/>
+      </w:pPr>
+      <w:r>
+        <w:t>Step 1: Softmax probabilities</w:t>
+      </w:r>
+    </w:p>
+    <w:p>
+      <w:pPr>
+        <w:pStyle w:val="ListBullet"/>
+      </w:pPr>
+      <w:r>
+        <w:t>exp_logits = [exp(2.5), exp(0.3), exp(-1.8)] = [12.18, 1.35, 0.17]</w:t>
+      </w:r>
+    </w:p>
+    <w:p>
+      <w:pPr>
+        <w:pStyle w:val="ListBullet"/>
+      </w:pPr>
+      <w:r>
+        <w:t>sum_exp = 12.18 + 1.35 + 0.17 = 13.70</w:t>
+      </w:r>
+    </w:p>
+    <w:p>
+      <w:pPr>
+        <w:pStyle w:val="ListBullet"/>
+      </w:pPr>
+      <w:r>
+        <w:t>p = [12.18/13.70, 1.35/13.70, 0.17/13.70] = [0.889, 0.099, 0.012]</w:t>
+      </w:r>
+    </w:p>
+    <w:p>
+      <w:pPr>
+        <w:pStyle w:val="ListBullet"/>
+      </w:pPr>
+      <w:r>
+        <w:t>Step 2: Label Smoothing Cross-Entropy (α=0.2)</w:t>
+      </w:r>
+    </w:p>
+    <w:p>
+      <w:pPr>
+        <w:pStyle w:val="ListBullet"/>
+      </w:pPr>
+      <w:r>
+        <w:t>y_smooth = [1-0.2, 0.2/2, 0.2/2] = [0.8, 0.1, 0.1]</w:t>
+      </w:r>
+    </w:p>
+    <w:p>
+      <w:pPr>
+        <w:pStyle w:val="ListBullet"/>
+      </w:pPr>
+      <w:r>
+        <w:t>L_label_smoothing = -(0.8×log(0.889) + 0.1×log(0.099) + 0.1×log(0.012))</w:t>
+      </w:r>
+    </w:p>
+    <w:p>
+      <w:pPr>
+        <w:pStyle w:val="ListBullet"/>
+      </w:pPr>
+      <w:r>
+        <w:t>L_label_smoothing = -(0.8×(-0.118) + 0.1×(-2.313) + 0.1×(-4.423))</w:t>
+      </w:r>
+    </w:p>
+    <w:p>
+      <w:pPr>
+        <w:pStyle w:val="ListBullet"/>
+      </w:pPr>
+      <w:r>
+        <w:t>L_label_smoothing = -(-0.094 - 0.231 - 0.442) = 0.767</w:t>
+      </w:r>
+    </w:p>
+    <w:p>
+      <w:pPr>
+        <w:pStyle w:val="ListBullet"/>
+      </w:pPr>
+      <w:r>
+        <w:t>Step 3: Focal Loss (α=1.0, γ=2.0)</w:t>
+      </w:r>
+    </w:p>
+    <w:p>
+      <w:pPr>
+        <w:pStyle w:val="ListBullet"/>
+      </w:pPr>
+      <w:r>
+        <w:t>p_t = p[0] = 0.889</w:t>
+      </w:r>
+    </w:p>
+    <w:p>
+      <w:pPr>
+        <w:pStyle w:val="ListBullet"/>
+      </w:pPr>
+      <w:r>
+        <w:t>CE_loss = -log(0.889) = 0.118</w:t>
+      </w:r>
+    </w:p>
+    <w:p>
+      <w:pPr>
+        <w:pStyle w:val="ListBullet"/>
+      </w:pPr>
+      <w:r>
+        <w:t>(1 - p_t)^γ = (1 - 0.889)^2.0 = (0.111)^2.0 = 0.012</w:t>
+      </w:r>
+    </w:p>
+    <w:p>
+      <w:pPr>
+        <w:pStyle w:val="ListBullet"/>
+      </w:pPr>
+      <w:r>
+        <w:t>L_focal = 1.0 × 0.012 × 0.118 = 0.001</w:t>
+      </w:r>
+    </w:p>
+    <w:p>
+      <w:pPr>
+        <w:pStyle w:val="ListBullet"/>
+      </w:pPr>
+      <w:r>
+        <w:t>Step 4: Combined Loss</w:t>
+      </w:r>
+    </w:p>
+    <w:p>
+      <w:pPr>
+        <w:pStyle w:val="ListBullet"/>
+      </w:pPr>
+      <w:r>
+        <w:t>L_total = 0.6 × 0.767 + 0.4 × 0.001 = 0.460 + 0.0004 = 0.460</w:t>
+      </w:r>
+    </w:p>
+    <w:p>
+      <w:pPr>
+        <w:pStyle w:val="ListBullet"/>
+      </w:pPr>
+      <w:r>
+        <w:t>Rata-rata loss pada test set: 0.7992 (sesuai dengan eval_results.txt)</w:t>
+      </w:r>
+    </w:p>
+    <w:p>
+      <w:pPr>
+        <w:pStyle w:val="Heading2"/>
+      </w:pPr>
+      <w:r>
+        <w:rPr>
+          <w:b/>
+        </w:rPr>
+        <w:t>5.4.3 Perhitungan Manual Metrik Evaluasi (Data Aktual)</w:t>
+      </w:r>
+    </w:p>
+    <w:p>
+      <w:r>
+        <w:t>Berikut perhitungan manual metrik evaluasi berdasarkan hasil aktual pada test set (1037 samples):</w:t>
+      </w:r>
+    </w:p>
+    <w:p>
+      <w:r>
+        <w:rPr>
+          <w:b/>
+        </w:rPr>
+        <w:t>Accuracy</w:t>
+      </w:r>
+    </w:p>
+    <w:p>
+      <w:pPr>
+        <w:pStyle w:val="ListBullet"/>
+      </w:pPr>
+      <w:r>
+        <w:t>Accuracy = (TP + TN) / Total = 0.8608 = 86.08%</w:t>
+      </w:r>
+    </w:p>
+    <w:p>
+      <w:pPr>
+        <w:pStyle w:val="ListBullet"/>
+      </w:pPr>
+      <w:r>
+        <w:t>Jumlah prediksi benar = 893 dari 1037 samples</w:t>
+      </w:r>
+    </w:p>
+    <w:p>
+      <w:r>
+        <w:rPr>
+          <w:b/>
+        </w:rPr>
+        <w:t>Macro Precision</w:t>
+      </w:r>
+    </w:p>
+    <w:p>
+      <w:pPr>
+        <w:pStyle w:val="ListBullet"/>
+      </w:pPr>
+      <w:r>
+        <w:t>Macro Precision = 0.8226 = 82.26%</w:t>
+      </w:r>
+    </w:p>
+    <w:p>
+      <w:r>
+        <w:rPr>
+          <w:b/>
+        </w:rPr>
+        <w:t>Macro Recall</w:t>
+      </w:r>
+    </w:p>
+    <w:p>
+      <w:pPr>
+        <w:pStyle w:val="ListBullet"/>
+      </w:pPr>
+      <w:r>
+        <w:t>Macro Recall = 0.8081 = 80.81%</w:t>
+      </w:r>
+    </w:p>
+    <w:p>
+      <w:r>
+        <w:rPr>
+          <w:b/>
+        </w:rPr>
+        <w:t>Macro F1-Score</w:t>
+      </w:r>
+    </w:p>
+    <w:p>
+      <w:pPr>
+        <w:pStyle w:val="ListBullet"/>
+      </w:pPr>
+      <w:r>
+        <w:t>Macro F1 = 2 × (Precision × Recall) / (Precision + Recall)</w:t>
+      </w:r>
+    </w:p>
+    <w:p>
+      <w:pPr>
+        <w:pStyle w:val="ListBullet"/>
+      </w:pPr>
+      <w:r>
+        <w:t>Macro F1 = 2 × (0.8226 × 0.8081) / (0.8226 + 0.8081)</w:t>
+      </w:r>
+    </w:p>
+    <w:p>
+      <w:pPr>
+        <w:pStyle w:val="ListBullet"/>
+      </w:pPr>
+      <w:r>
+        <w:t>Macro F1 = 2 × 0.6648 / 1.6307 = 0.8153</w:t>
+      </w:r>
+    </w:p>
+    <w:p>
+      <w:pPr>
+        <w:pStyle w:val="ListBullet"/>
+      </w:pPr>
+      <w:r>
+        <w:t>Nilai aktual dari model: 0.8149 (81.49%)</w:t>
+      </w:r>
+    </w:p>
+    <w:p>
+      <w:pPr>
+        <w:pStyle w:val="Heading1"/>
+      </w:pPr>
+      <w:r>
+        <w:rPr>
+          <w:b/>
+        </w:rPr>
+        <w:t>5.4 Perhitungan Manual TomBERT</w:t>
       </w:r>
     </w:p>
     <w:p>

</xml_diff>